<commit_message>
Update dashboard validation and project documentation
Co-authored-by: Copilot <223556219+Copilot@users.noreply.github.com>
</commit_message>
<xml_diff>
--- a/docs/project_report.docx
+++ b/docs/project_report.docx
@@ -2332,10 +2332,7 @@
     </w:p>
     <w:p>
       <w:r>
-        <w:rPr>
-          <w:rFonts w:ascii="Aptos" w:hAnsi="Aptos"/>
-        </w:rPr>
-        <w:t>Its responsibilities include handling request fields, generating a fallback request ID when one is missing, retrieving the current AWS caller identity, checking S3 access, storing JSON results, and publishing an MQTT response.</w:t>
+        <w:t>Its responsibilities include validating request fields, retrieving the current AWS caller identity for valid requests, checking S3 access, storing JSON results, and publishing an MQTT response.</w:t>
       </w:r>
     </w:p>
     <w:p>
@@ -3543,18 +3540,12 @@
     </w:p>
     <w:p>
       <w:r>
-        <w:rPr>
-          <w:rFonts w:ascii="Aptos" w:hAnsi="Aptos"/>
-        </w:rPr>
-        <w:t>The processing logic handles request information, retrieves the current AWS caller identity, performs the configured S3 check, and prepares a result object.</w:t>
+        <w:t>For valid requests, the processing logic handles request information, retrieves the current AWS caller identity, performs the configured S3 check, and prepares a result object. Request validation occurs before the identity and S3 checks.</w:t>
       </w:r>
     </w:p>
     <w:p>
       <w:r>
-        <w:rPr>
-          <w:rFonts w:ascii="Aptos" w:hAnsi="Aptos"/>
-        </w:rPr>
-        <w:t>When a request ID is missing, the implementation generates a fallback ID. This behavior was observed during testing.</w:t>
+        <w:t>The updated implementation requires requestId to be a non-empty string. Requests with a missing, null, empty, or numeric request ID are rejected with status FAILURE. For these invalid requests, the S3 access check is not performed and s3Access is recorded as NOT_TESTED. If the failure report is saved successfully, storageStatus is SUCCESS; this indicates successful storage of the failure report, not successful processing of the original request.</w:t>
       </w:r>
     </w:p>
     <w:p>
@@ -4111,10 +4102,7 @@
     </w:p>
     <w:p>
       <w:r>
-        <w:rPr>
-          <w:rFonts w:ascii="Aptos" w:hAnsi="Aptos"/>
-        </w:rPr>
-        <w:t>The prototype was tested using MQTT requests, request-ID variations, multiple requests, S3 result inspection, and dashboard verification.</w:t>
+        <w:t>The prototype was tested using valid MQTT requests, missing and invalid request IDs, multiple requests, S3 result inspection, dashboard auto-refresh, CSV export, request-detail inspection, and end-to-end workflow verification. The results below reflect tests confirmed during the project validation session. Malformed JSON rejection and a live S3 access-denied scenario remain unverified.</w:t>
       </w:r>
     </w:p>
     <w:p>
@@ -4158,16 +4146,7 @@
             <w:shd w:fill="DCE7F2"/>
           </w:tcPr>
           <w:p>
-            <w:pPr>
-              <w:spacing w:after="0" w:line="240" w:lineRule="auto"/>
-            </w:pPr>
             <w:r>
-              <w:rPr>
-                <w:rFonts w:ascii="Aptos" w:hAnsi="Aptos"/>
-                <w:b/>
-                <w:color w:val="000000"/>
-                <w:sz w:val="19"/>
-              </w:rPr>
               <w:t>Test ID</w:t>
             </w:r>
           </w:p>
@@ -4185,16 +4164,7 @@
             <w:shd w:fill="DCE7F2"/>
           </w:tcPr>
           <w:p>
-            <w:pPr>
-              <w:spacing w:after="0" w:line="240" w:lineRule="auto"/>
-            </w:pPr>
             <w:r>
-              <w:rPr>
-                <w:rFonts w:ascii="Aptos" w:hAnsi="Aptos"/>
-                <w:b/>
-                <w:color w:val="000000"/>
-                <w:sz w:val="19"/>
-              </w:rPr>
               <w:t>Scenario</w:t>
             </w:r>
           </w:p>
@@ -4212,16 +4182,7 @@
             <w:shd w:fill="DCE7F2"/>
           </w:tcPr>
           <w:p>
-            <w:pPr>
-              <w:spacing w:after="0" w:line="240" w:lineRule="auto"/>
-            </w:pPr>
             <w:r>
-              <w:rPr>
-                <w:rFonts w:ascii="Aptos" w:hAnsi="Aptos"/>
-                <w:b/>
-                <w:color w:val="000000"/>
-                <w:sz w:val="19"/>
-              </w:rPr>
               <w:t>Result</w:t>
             </w:r>
           </w:p>
@@ -4241,15 +4202,7 @@
             <w:shd w:fill="FFFFFF"/>
           </w:tcPr>
           <w:p>
-            <w:pPr>
-              <w:spacing w:after="0" w:line="240" w:lineRule="auto"/>
-            </w:pPr>
             <w:r>
-              <w:rPr>
-                <w:rFonts w:ascii="Aptos" w:hAnsi="Aptos"/>
-                <w:color w:val="202020"/>
-                <w:sz w:val="19"/>
-              </w:rPr>
               <w:t>TC-01</w:t>
             </w:r>
           </w:p>
@@ -4267,15 +4220,7 @@
             <w:shd w:fill="FFFFFF"/>
           </w:tcPr>
           <w:p>
-            <w:pPr>
-              <w:spacing w:after="0" w:line="240" w:lineRule="auto"/>
-            </w:pPr>
             <w:r>
-              <w:rPr>
-                <w:rFonts w:ascii="Aptos" w:hAnsi="Aptos"/>
-                <w:color w:val="202020"/>
-                <w:sz w:val="19"/>
-              </w:rPr>
               <w:t>Valid MQTT request</w:t>
             </w:r>
           </w:p>
@@ -4293,15 +4238,7 @@
             <w:shd w:fill="FFFFFF"/>
           </w:tcPr>
           <w:p>
-            <w:pPr>
-              <w:spacing w:after="0" w:line="240" w:lineRule="auto"/>
-            </w:pPr>
             <w:r>
-              <w:rPr>
-                <w:rFonts w:ascii="Aptos" w:hAnsi="Aptos"/>
-                <w:color w:val="202020"/>
-                <w:sz w:val="19"/>
-              </w:rPr>
               <w:t>PASS</w:t>
             </w:r>
           </w:p>
@@ -4321,15 +4258,7 @@
             <w:shd w:fill="F7F9FB"/>
           </w:tcPr>
           <w:p>
-            <w:pPr>
-              <w:spacing w:after="0" w:line="240" w:lineRule="auto"/>
-            </w:pPr>
             <w:r>
-              <w:rPr>
-                <w:rFonts w:ascii="Aptos" w:hAnsi="Aptos"/>
-                <w:color w:val="202020"/>
-                <w:sz w:val="19"/>
-              </w:rPr>
               <w:t>TC-02</w:t>
             </w:r>
           </w:p>
@@ -4347,16 +4276,8 @@
             <w:shd w:fill="F7F9FB"/>
           </w:tcPr>
           <w:p>
-            <w:pPr>
-              <w:spacing w:after="0" w:line="240" w:lineRule="auto"/>
-            </w:pPr>
             <w:r>
-              <w:rPr>
-                <w:rFonts w:ascii="Aptos" w:hAnsi="Aptos"/>
-                <w:color w:val="202020"/>
-                <w:sz w:val="19"/>
-              </w:rPr>
-              <w:t>Different request IDs</w:t>
+              <w:t>Requests with different IDs</w:t>
             </w:r>
           </w:p>
         </w:tc>
@@ -4373,15 +4294,7 @@
             <w:shd w:fill="F7F9FB"/>
           </w:tcPr>
           <w:p>
-            <w:pPr>
-              <w:spacing w:after="0" w:line="240" w:lineRule="auto"/>
-            </w:pPr>
             <w:r>
-              <w:rPr>
-                <w:rFonts w:ascii="Aptos" w:hAnsi="Aptos"/>
-                <w:color w:val="202020"/>
-                <w:sz w:val="19"/>
-              </w:rPr>
               <w:t>PASS</w:t>
             </w:r>
           </w:p>
@@ -4401,15 +4314,7 @@
             <w:shd w:fill="FFFFFF"/>
           </w:tcPr>
           <w:p>
-            <w:pPr>
-              <w:spacing w:after="0" w:line="240" w:lineRule="auto"/>
-            </w:pPr>
             <w:r>
-              <w:rPr>
-                <w:rFonts w:ascii="Aptos" w:hAnsi="Aptos"/>
-                <w:color w:val="202020"/>
-                <w:sz w:val="19"/>
-              </w:rPr>
               <w:t>TC-03</w:t>
             </w:r>
           </w:p>
@@ -4427,15 +4332,7 @@
             <w:shd w:fill="FFFFFF"/>
           </w:tcPr>
           <w:p>
-            <w:pPr>
-              <w:spacing w:after="0" w:line="240" w:lineRule="auto"/>
-            </w:pPr>
             <w:r>
-              <w:rPr>
-                <w:rFonts w:ascii="Aptos" w:hAnsi="Aptos"/>
-                <w:color w:val="202020"/>
-                <w:sz w:val="19"/>
-              </w:rPr>
               <w:t>Missing request ID</w:t>
             </w:r>
           </w:p>
@@ -4453,16 +4350,8 @@
             <w:shd w:fill="FFFFFF"/>
           </w:tcPr>
           <w:p>
-            <w:pPr>
-              <w:spacing w:after="0" w:line="240" w:lineRule="auto"/>
-            </w:pPr>
             <w:r>
-              <w:rPr>
-                <w:rFonts w:ascii="Aptos" w:hAnsi="Aptos"/>
-                <w:color w:val="202020"/>
-                <w:sz w:val="19"/>
-              </w:rPr>
-              <w:t>PASS — fallback ID generated</w:t>
+              <w:t>PASS — rejected; failure report stored</w:t>
             </w:r>
           </w:p>
         </w:tc>
@@ -4481,15 +4370,7 @@
             <w:shd w:fill="F7F9FB"/>
           </w:tcPr>
           <w:p>
-            <w:pPr>
-              <w:spacing w:after="0" w:line="240" w:lineRule="auto"/>
-            </w:pPr>
             <w:r>
-              <w:rPr>
-                <w:rFonts w:ascii="Aptos" w:hAnsi="Aptos"/>
-                <w:color w:val="202020"/>
-                <w:sz w:val="19"/>
-              </w:rPr>
               <w:t>TC-04</w:t>
             </w:r>
           </w:p>
@@ -4507,16 +4388,8 @@
             <w:shd w:fill="F7F9FB"/>
           </w:tcPr>
           <w:p>
-            <w:pPr>
-              <w:spacing w:after="0" w:line="240" w:lineRule="auto"/>
-            </w:pPr>
             <w:r>
-              <w:rPr>
-                <w:rFonts w:ascii="Aptos" w:hAnsi="Aptos"/>
-                <w:color w:val="202020"/>
-                <w:sz w:val="19"/>
-              </w:rPr>
-              <w:t>Empty JSON request</w:t>
+              <w:t>Empty JSON object {}</w:t>
             </w:r>
           </w:p>
         </w:tc>
@@ -4533,16 +4406,8 @@
             <w:shd w:fill="F7F9FB"/>
           </w:tcPr>
           <w:p>
-            <w:pPr>
-              <w:spacing w:after="0" w:line="240" w:lineRule="auto"/>
-            </w:pPr>
             <w:r>
-              <w:rPr>
-                <w:rFonts w:ascii="Aptos" w:hAnsi="Aptos"/>
-                <w:color w:val="202020"/>
-                <w:sz w:val="19"/>
-              </w:rPr>
-              <w:t>PASS — observed fallback behavior</w:t>
+              <w:t>PASS WITH QUALIFICATION — standalone case requires retesting</w:t>
             </w:r>
           </w:p>
         </w:tc>
@@ -4561,15 +4426,7 @@
             <w:shd w:fill="FFFFFF"/>
           </w:tcPr>
           <w:p>
-            <w:pPr>
-              <w:spacing w:after="0" w:line="240" w:lineRule="auto"/>
-            </w:pPr>
             <w:r>
-              <w:rPr>
-                <w:rFonts w:ascii="Aptos" w:hAnsi="Aptos"/>
-                <w:color w:val="202020"/>
-                <w:sz w:val="19"/>
-              </w:rPr>
               <w:t>TC-05</w:t>
             </w:r>
           </w:p>
@@ -4587,15 +4444,7 @@
             <w:shd w:fill="FFFFFF"/>
           </w:tcPr>
           <w:p>
-            <w:pPr>
-              <w:spacing w:after="0" w:line="240" w:lineRule="auto"/>
-            </w:pPr>
             <w:r>
-              <w:rPr>
-                <w:rFonts w:ascii="Aptos" w:hAnsi="Aptos"/>
-                <w:color w:val="202020"/>
-                <w:sz w:val="19"/>
-              </w:rPr>
               <w:t>Malformed JSON</w:t>
             </w:r>
           </w:p>
@@ -4613,15 +4462,7 @@
             <w:shd w:fill="FFFFFF"/>
           </w:tcPr>
           <w:p>
-            <w:pPr>
-              <w:spacing w:after="0" w:line="240" w:lineRule="auto"/>
-            </w:pPr>
             <w:r>
-              <w:rPr>
-                <w:rFonts w:ascii="Aptos" w:hAnsi="Aptos"/>
-                <w:color w:val="202020"/>
-                <w:sz w:val="19"/>
-              </w:rPr>
               <w:t>INCONCLUSIVE — rejection point not confirmed</w:t>
             </w:r>
           </w:p>
@@ -4641,15 +4482,7 @@
             <w:shd w:fill="F7F9FB"/>
           </w:tcPr>
           <w:p>
-            <w:pPr>
-              <w:spacing w:after="0" w:line="240" w:lineRule="auto"/>
-            </w:pPr>
             <w:r>
-              <w:rPr>
-                <w:rFonts w:ascii="Aptos" w:hAnsi="Aptos"/>
-                <w:color w:val="202020"/>
-                <w:sz w:val="19"/>
-              </w:rPr>
               <w:t>TC-06</w:t>
             </w:r>
           </w:p>
@@ -4667,15 +4500,7 @@
             <w:shd w:fill="F7F9FB"/>
           </w:tcPr>
           <w:p>
-            <w:pPr>
-              <w:spacing w:after="0" w:line="240" w:lineRule="auto"/>
-            </w:pPr>
             <w:r>
-              <w:rPr>
-                <w:rFonts w:ascii="Aptos" w:hAnsi="Aptos"/>
-                <w:color w:val="202020"/>
-                <w:sz w:val="19"/>
-              </w:rPr>
               <w:t>S3 access-denied handling</w:t>
             </w:r>
           </w:p>
@@ -4693,15 +4518,7 @@
             <w:shd w:fill="F7F9FB"/>
           </w:tcPr>
           <w:p>
-            <w:pPr>
-              <w:spacing w:after="0" w:line="240" w:lineRule="auto"/>
-            </w:pPr>
             <w:r>
-              <w:rPr>
-                <w:rFonts w:ascii="Aptos" w:hAnsi="Aptos"/>
-                <w:color w:val="202020"/>
-                <w:sz w:val="19"/>
-              </w:rPr>
               <w:t>NOT EXECUTED — code inspected only</w:t>
             </w:r>
           </w:p>
@@ -4721,15 +4538,7 @@
             <w:shd w:fill="FFFFFF"/>
           </w:tcPr>
           <w:p>
-            <w:pPr>
-              <w:spacing w:after="0" w:line="240" w:lineRule="auto"/>
-            </w:pPr>
             <w:r>
-              <w:rPr>
-                <w:rFonts w:ascii="Aptos" w:hAnsi="Aptos"/>
-                <w:color w:val="202020"/>
-                <w:sz w:val="19"/>
-              </w:rPr>
               <w:t>TC-07</w:t>
             </w:r>
           </w:p>
@@ -4747,15 +4556,7 @@
             <w:shd w:fill="FFFFFF"/>
           </w:tcPr>
           <w:p>
-            <w:pPr>
-              <w:spacing w:after="0" w:line="240" w:lineRule="auto"/>
-            </w:pPr>
             <w:r>
-              <w:rPr>
-                <w:rFonts w:ascii="Aptos" w:hAnsi="Aptos"/>
-                <w:color w:val="202020"/>
-                <w:sz w:val="19"/>
-              </w:rPr>
               <w:t>Automatic dashboard refresh</w:t>
             </w:r>
           </w:p>
@@ -4773,15 +4574,7 @@
             <w:shd w:fill="FFFFFF"/>
           </w:tcPr>
           <w:p>
-            <w:pPr>
-              <w:spacing w:after="0" w:line="240" w:lineRule="auto"/>
-            </w:pPr>
             <w:r>
-              <w:rPr>
-                <w:rFonts w:ascii="Aptos" w:hAnsi="Aptos"/>
-                <w:color w:val="202020"/>
-                <w:sz w:val="19"/>
-              </w:rPr>
               <w:t>PASS</w:t>
             </w:r>
           </w:p>
@@ -4801,15 +4594,7 @@
             <w:shd w:fill="F7F9FB"/>
           </w:tcPr>
           <w:p>
-            <w:pPr>
-              <w:spacing w:after="0" w:line="240" w:lineRule="auto"/>
-            </w:pPr>
             <w:r>
-              <w:rPr>
-                <w:rFonts w:ascii="Aptos" w:hAnsi="Aptos"/>
-                <w:color w:val="202020"/>
-                <w:sz w:val="19"/>
-              </w:rPr>
               <w:t>TC-08</w:t>
             </w:r>
           </w:p>
@@ -4827,15 +4612,7 @@
             <w:shd w:fill="F7F9FB"/>
           </w:tcPr>
           <w:p>
-            <w:pPr>
-              <w:spacing w:after="0" w:line="240" w:lineRule="auto"/>
-            </w:pPr>
             <w:r>
-              <w:rPr>
-                <w:rFonts w:ascii="Aptos" w:hAnsi="Aptos"/>
-                <w:color w:val="202020"/>
-                <w:sz w:val="19"/>
-              </w:rPr>
               <w:t>Multiple requests</w:t>
             </w:r>
           </w:p>
@@ -4853,15 +4630,7 @@
             <w:shd w:fill="F7F9FB"/>
           </w:tcPr>
           <w:p>
-            <w:pPr>
-              <w:spacing w:after="0" w:line="240" w:lineRule="auto"/>
-            </w:pPr>
             <w:r>
-              <w:rPr>
-                <w:rFonts w:ascii="Aptos" w:hAnsi="Aptos"/>
-                <w:color w:val="202020"/>
-                <w:sz w:val="19"/>
-              </w:rPr>
               <w:t>PASS</w:t>
             </w:r>
           </w:p>
@@ -4881,15 +4650,7 @@
             <w:shd w:fill="FFFFFF"/>
           </w:tcPr>
           <w:p>
-            <w:pPr>
-              <w:spacing w:after="0" w:line="240" w:lineRule="auto"/>
-            </w:pPr>
             <w:r>
-              <w:rPr>
-                <w:rFonts w:ascii="Aptos" w:hAnsi="Aptos"/>
-                <w:color w:val="202020"/>
-                <w:sz w:val="19"/>
-              </w:rPr>
               <w:t>TC-09</w:t>
             </w:r>
           </w:p>
@@ -4907,15 +4668,7 @@
             <w:shd w:fill="FFFFFF"/>
           </w:tcPr>
           <w:p>
-            <w:pPr>
-              <w:spacing w:after="0" w:line="240" w:lineRule="auto"/>
-            </w:pPr>
             <w:r>
-              <w:rPr>
-                <w:rFonts w:ascii="Aptos" w:hAnsi="Aptos"/>
-                <w:color w:val="202020"/>
-                <w:sz w:val="19"/>
-              </w:rPr>
               <w:t>Final end-to-end validation</w:t>
             </w:r>
           </w:p>
@@ -4933,15 +4686,263 @@
             <w:shd w:fill="FFFFFF"/>
           </w:tcPr>
           <w:p>
-            <w:pPr>
-              <w:spacing w:after="0" w:line="240" w:lineRule="auto"/>
-            </w:pPr>
             <w:r>
-              <w:rPr>
-                <w:rFonts w:ascii="Aptos" w:hAnsi="Aptos"/>
-                <w:color w:val="202020"/>
-                <w:sz w:val="19"/>
-              </w:rPr>
+              <w:t>PASS</w:t>
+            </w:r>
+          </w:p>
+        </w:tc>
+      </w:tr>
+      <w:tr>
+        <w:tc>
+          <w:tcPr>
+            <w:tcW w:type="dxa" w:w="3235"/>
+          </w:tcPr>
+          <w:p>
+            <w:r>
+              <w:t>TC-10</w:t>
+            </w:r>
+          </w:p>
+        </w:tc>
+        <w:tc>
+          <w:tcPr>
+            <w:tcW w:type="dxa" w:w="3235"/>
+          </w:tcPr>
+          <w:p>
+            <w:r>
+              <w:t>Missing request ID validation</w:t>
+            </w:r>
+          </w:p>
+        </w:tc>
+        <w:tc>
+          <w:tcPr>
+            <w:tcW w:type="dxa" w:w="3235"/>
+          </w:tcPr>
+          <w:p>
+            <w:r>
+              <w:t>PASS</w:t>
+            </w:r>
+          </w:p>
+        </w:tc>
+      </w:tr>
+      <w:tr>
+        <w:tc>
+          <w:tcPr>
+            <w:tcW w:type="dxa" w:w="3235"/>
+          </w:tcPr>
+          <w:p>
+            <w:r>
+              <w:t>TC-11</w:t>
+            </w:r>
+          </w:p>
+        </w:tc>
+        <w:tc>
+          <w:tcPr>
+            <w:tcW w:type="dxa" w:w="3235"/>
+          </w:tcPr>
+          <w:p>
+            <w:r>
+              <w:t>Empty-string request ID</w:t>
+            </w:r>
+          </w:p>
+        </w:tc>
+        <w:tc>
+          <w:tcPr>
+            <w:tcW w:type="dxa" w:w="3235"/>
+          </w:tcPr>
+          <w:p>
+            <w:r>
+              <w:t>PASS</w:t>
+            </w:r>
+          </w:p>
+        </w:tc>
+      </w:tr>
+      <w:tr>
+        <w:tc>
+          <w:tcPr>
+            <w:tcW w:type="dxa" w:w="3235"/>
+          </w:tcPr>
+          <w:p>
+            <w:r>
+              <w:t>TC-12</w:t>
+            </w:r>
+          </w:p>
+        </w:tc>
+        <w:tc>
+          <w:tcPr>
+            <w:tcW w:type="dxa" w:w="3235"/>
+          </w:tcPr>
+          <w:p>
+            <w:r>
+              <w:t>Numeric request ID</w:t>
+            </w:r>
+          </w:p>
+        </w:tc>
+        <w:tc>
+          <w:tcPr>
+            <w:tcW w:type="dxa" w:w="3235"/>
+          </w:tcPr>
+          <w:p>
+            <w:r>
+              <w:t>PASS</w:t>
+            </w:r>
+          </w:p>
+        </w:tc>
+      </w:tr>
+      <w:tr>
+        <w:tc>
+          <w:tcPr>
+            <w:tcW w:type="dxa" w:w="3235"/>
+          </w:tcPr>
+          <w:p>
+            <w:r>
+              <w:t>TC-13</w:t>
+            </w:r>
+          </w:p>
+        </w:tc>
+        <w:tc>
+          <w:tcPr>
+            <w:tcW w:type="dxa" w:w="3235"/>
+          </w:tcPr>
+          <w:p>
+            <w:r>
+              <w:t>Multiple valid requests</w:t>
+            </w:r>
+          </w:p>
+        </w:tc>
+        <w:tc>
+          <w:tcPr>
+            <w:tcW w:type="dxa" w:w="3235"/>
+          </w:tcPr>
+          <w:p>
+            <w:r>
+              <w:t>PASS</w:t>
+            </w:r>
+          </w:p>
+        </w:tc>
+      </w:tr>
+      <w:tr>
+        <w:tc>
+          <w:tcPr>
+            <w:tcW w:type="dxa" w:w="3235"/>
+          </w:tcPr>
+          <w:p>
+            <w:r>
+              <w:t>TC-14</w:t>
+            </w:r>
+          </w:p>
+        </w:tc>
+        <w:tc>
+          <w:tcPr>
+            <w:tcW w:type="dxa" w:w="3235"/>
+          </w:tcPr>
+          <w:p>
+            <w:r>
+              <w:t>Dashboard auto-refresh with a new request</w:t>
+            </w:r>
+          </w:p>
+        </w:tc>
+        <w:tc>
+          <w:tcPr>
+            <w:tcW w:type="dxa" w:w="3235"/>
+          </w:tcPr>
+          <w:p>
+            <w:r>
+              <w:t>PASS</w:t>
+            </w:r>
+          </w:p>
+        </w:tc>
+      </w:tr>
+      <w:tr>
+        <w:tc>
+          <w:tcPr>
+            <w:tcW w:type="dxa" w:w="3235"/>
+          </w:tcPr>
+          <w:p>
+            <w:r>
+              <w:t>TC-15</w:t>
+            </w:r>
+          </w:p>
+        </w:tc>
+        <w:tc>
+          <w:tcPr>
+            <w:tcW w:type="dxa" w:w="3235"/>
+          </w:tcPr>
+          <w:p>
+            <w:r>
+              <w:t>CSV export</w:t>
+            </w:r>
+          </w:p>
+        </w:tc>
+        <w:tc>
+          <w:tcPr>
+            <w:tcW w:type="dxa" w:w="3235"/>
+          </w:tcPr>
+          <w:p>
+            <w:r>
+              <w:t>PASS</w:t>
+            </w:r>
+          </w:p>
+        </w:tc>
+      </w:tr>
+      <w:tr>
+        <w:tc>
+          <w:tcPr>
+            <w:tcW w:type="dxa" w:w="3235"/>
+          </w:tcPr>
+          <w:p>
+            <w:r>
+              <w:t>TC-16</w:t>
+            </w:r>
+          </w:p>
+        </w:tc>
+        <w:tc>
+          <w:tcPr>
+            <w:tcW w:type="dxa" w:w="3235"/>
+          </w:tcPr>
+          <w:p>
+            <w:r>
+              <w:t>Successful and failed request details</w:t>
+            </w:r>
+          </w:p>
+        </w:tc>
+        <w:tc>
+          <w:tcPr>
+            <w:tcW w:type="dxa" w:w="3235"/>
+          </w:tcPr>
+          <w:p>
+            <w:r>
+              <w:t>PASS</w:t>
+            </w:r>
+          </w:p>
+        </w:tc>
+      </w:tr>
+      <w:tr>
+        <w:tc>
+          <w:tcPr>
+            <w:tcW w:type="dxa" w:w="3235"/>
+          </w:tcPr>
+          <w:p>
+            <w:r>
+              <w:t>TC-17</w:t>
+            </w:r>
+          </w:p>
+        </w:tc>
+        <w:tc>
+          <w:tcPr>
+            <w:tcW w:type="dxa" w:w="3235"/>
+          </w:tcPr>
+          <w:p>
+            <w:r>
+              <w:t>Final MQTT-to-S3-to-dashboard verification</w:t>
+            </w:r>
+          </w:p>
+        </w:tc>
+        <w:tc>
+          <w:tcPr>
+            <w:tcW w:type="dxa" w:w="3235"/>
+          </w:tcPr>
+          <w:p>
+            <w:r>
               <w:t>PASS</w:t>
             </w:r>
           </w:p>
@@ -4952,6 +4953,9 @@
       <w:pPr>
         <w:spacing w:after="40"/>
       </w:pPr>
+      <w:r>
+        <w:t>Across 17 listed test cases: 14 are confirmed PASS, TC-04 is provisionally passed with a qualification because the standalone empty-object scenario needs retesting, TC-05 is INCONCLUSIVE, and TC-06 was NOT EXECUTED. The confirmed test results are documented in test-results/test_cases.md.</w:t>
+      </w:r>
     </w:p>
     <w:p>
       <w:pPr>
@@ -4969,20 +4973,12 @@
     </w:p>
     <w:p>
       <w:r>
-        <w:rPr>
-          <w:rFonts w:ascii="Aptos" w:hAnsi="Aptos"/>
-        </w:rPr>
-        <w:t>The final validation used the request ID:</w:t>
+        <w:t>The final end-to-end validation used a unique test request ID (the final test was confirmed by the user; the workflow was checked across MQTT, S3, and the deployed Streamlit dashboard). Earlier testing also used the request ID:</w:t>
       </w:r>
     </w:p>
     <w:p>
       <w:r>
-        <w:rPr>
-          <w:rFonts w:ascii="Consolas" w:hAnsi="Consolas"/>
-          <w:color w:val="303030"/>
-          <w:sz w:val="20"/>
-        </w:rPr>
-        <w:t>FINAL-TEST-001</w:t>
+        <w:t>FINAL-E2E-008 (or another unique ID selected during testing)</w:t>
       </w:r>
     </w:p>
     <w:p>
@@ -4995,20 +4991,12 @@
     </w:p>
     <w:p>
       <w:r>
-        <w:rPr>
-          <w:rFonts w:ascii="Consolas" w:hAnsi="Consolas"/>
-          <w:color w:val="303030"/>
-          <w:sz w:val="20"/>
-        </w:rPr>
-        <w:t>Final end-to-end validation</w:t>
+        <w:t>Final end-to-end system verification</w:t>
       </w:r>
     </w:p>
     <w:p>
       <w:r>
-        <w:rPr>
-          <w:rFonts w:ascii="Aptos" w:hAnsi="Aptos"/>
-        </w:rPr>
-        <w:t>The user confirmed that the request-processing workflow worked across MQTT, S3, and the Streamlit dashboard.</w:t>
+        <w:t>The user confirmed that the request-processing workflow worked across MQTT, S3, and the Streamlit dashboard. Additional checks confirmed validation of missing, empty, and numeric request IDs; processing of multiple valid requests; automatic dashboard refresh; CSV export; and inspection of successful and failed request details.</w:t>
       </w:r>
     </w:p>
     <w:p>
@@ -5109,24 +5097,7 @@
         <w:ind w:left="403" w:hanging="403"/>
       </w:pPr>
       <w:r>
-        <w:rPr>
-          <w:rFonts w:ascii="Aptos" w:hAnsi="Aptos"/>
-          <w:b/>
-        </w:rPr>
-        <w:t xml:space="preserve">1. </w:t>
-      </w:r>
-      <w:r>
-        <w:rPr>
-          <w:rFonts w:ascii="Aptos" w:hAnsi="Aptos"/>
-          <w:b/>
-        </w:rPr>
-        <w:t>Cross-account role assumption:</w:t>
-      </w:r>
-      <w:r>
-        <w:rPr>
-          <w:rFonts w:ascii="Aptos" w:hAnsi="Aptos"/>
-        </w:rPr>
-        <w:t xml:space="preserve"> Successful role assumption into the intended target account has not been verified.</w:t>
+        <w:t>1. Cross-account role assumption: Successful role assumption into the intended target account has not been verified.</w:t>
       </w:r>
     </w:p>
     <w:p>
@@ -5135,24 +5106,7 @@
         <w:ind w:left="403" w:hanging="403"/>
       </w:pPr>
       <w:r>
-        <w:rPr>
-          <w:rFonts w:ascii="Aptos" w:hAnsi="Aptos"/>
-          <w:b/>
-        </w:rPr>
-        <w:t xml:space="preserve">2. </w:t>
-      </w:r>
-      <w:r>
-        <w:rPr>
-          <w:rFonts w:ascii="Aptos" w:hAnsi="Aptos"/>
-          <w:b/>
-        </w:rPr>
-        <w:t>IAM restrictions:</w:t>
-      </w:r>
-      <w:r>
-        <w:rPr>
-          <w:rFonts w:ascii="Aptos" w:hAnsi="Aptos"/>
-        </w:rPr>
-        <w:t xml:space="preserve"> AWS Academy permissions limited the ability to configure or modify IAM roles and policies.</w:t>
+        <w:t>2. IAM restrictions: AWS Academy permissions limited the ability to configure or modify the IAM roles and policies needed for full cross-account verification.</w:t>
       </w:r>
     </w:p>
     <w:p>
@@ -5161,24 +5115,7 @@
         <w:ind w:left="403" w:hanging="403"/>
       </w:pPr>
       <w:r>
-        <w:rPr>
-          <w:rFonts w:ascii="Aptos" w:hAnsi="Aptos"/>
-          <w:b/>
-        </w:rPr>
-        <w:t xml:space="preserve">3. </w:t>
-      </w:r>
-      <w:r>
-        <w:rPr>
-          <w:rFonts w:ascii="Aptos" w:hAnsi="Aptos"/>
-          <w:b/>
-        </w:rPr>
-        <w:t>Malformed input testing:</w:t>
-      </w:r>
-      <w:r>
-        <w:rPr>
-          <w:rFonts w:ascii="Aptos" w:hAnsi="Aptos"/>
-        </w:rPr>
-        <w:t xml:space="preserve"> The exact point at which malformed JSON was rejected has not been confirmed.</w:t>
+        <w:t>3. Malformed input testing: The exact point at which malformed JSON is rejected has not been confirmed.</w:t>
       </w:r>
     </w:p>
     <w:p>
@@ -5187,24 +5124,7 @@
         <w:ind w:left="403" w:hanging="403"/>
       </w:pPr>
       <w:r>
-        <w:rPr>
-          <w:rFonts w:ascii="Aptos" w:hAnsi="Aptos"/>
-          <w:b/>
-        </w:rPr>
-        <w:t xml:space="preserve">4. </w:t>
-      </w:r>
-      <w:r>
-        <w:rPr>
-          <w:rFonts w:ascii="Aptos" w:hAnsi="Aptos"/>
-          <w:b/>
-        </w:rPr>
-        <w:t>S3 denial testing:</w:t>
-      </w:r>
-      <w:r>
-        <w:rPr>
-          <w:rFonts w:ascii="Aptos" w:hAnsi="Aptos"/>
-        </w:rPr>
-        <w:t xml:space="preserve"> A real access-denied scenario was not executed.</w:t>
+        <w:t>4. S3 denial testing: A real access-denied scenario was not executed.</w:t>
       </w:r>
     </w:p>
     <w:p>
@@ -5213,24 +5133,7 @@
         <w:ind w:left="403" w:hanging="403"/>
       </w:pPr>
       <w:r>
-        <w:rPr>
-          <w:rFonts w:ascii="Aptos" w:hAnsi="Aptos"/>
-          <w:b/>
-        </w:rPr>
-        <w:t xml:space="preserve">5. </w:t>
-      </w:r>
-      <w:r>
-        <w:rPr>
-          <w:rFonts w:ascii="Aptos" w:hAnsi="Aptos"/>
-          <w:b/>
-        </w:rPr>
-        <w:t>Monitoring scope:</w:t>
-      </w:r>
-      <w:r>
-        <w:rPr>
-          <w:rFonts w:ascii="Aptos" w:hAnsi="Aptos"/>
-        </w:rPr>
-        <w:t xml:space="preserve"> The dashboard displays stored request results; it is not a complete IAM authorization audit platform.</w:t>
+        <w:t>5. Monitoring scope: The dashboard displays stored request results; it is not a complete IAM authorization audit platform.</w:t>
       </w:r>
     </w:p>
     <w:p>
@@ -5239,24 +5142,7 @@
         <w:ind w:left="403" w:hanging="403"/>
       </w:pPr>
       <w:r>
-        <w:rPr>
-          <w:rFonts w:ascii="Aptos" w:hAnsi="Aptos"/>
-          <w:b/>
-        </w:rPr>
-        <w:t xml:space="preserve">6. </w:t>
-      </w:r>
-      <w:r>
-        <w:rPr>
-          <w:rFonts w:ascii="Aptos" w:hAnsi="Aptos"/>
-          <w:b/>
-        </w:rPr>
-        <w:t>Credential dependency:</w:t>
-      </w:r>
-      <w:r>
-        <w:rPr>
-          <w:rFonts w:ascii="Aptos" w:hAnsi="Aptos"/>
-        </w:rPr>
-        <w:t xml:space="preserve"> The dashboard requires valid AWS credentials with the necessary permissions to retrieve S3 objects.</w:t>
+        <w:t>6. Credential dependency: The deployed dashboard uses temporary AWS credentials for the demonstration. These credentials expire and must be refreshed using the applicable AWS Academy workflow.</w:t>
       </w:r>
     </w:p>
     <w:p>
@@ -5265,24 +5151,7 @@
         <w:ind w:left="403" w:hanging="403"/>
       </w:pPr>
       <w:r>
-        <w:rPr>
-          <w:rFonts w:ascii="Aptos" w:hAnsi="Aptos"/>
-          <w:b/>
-        </w:rPr>
-        <w:t xml:space="preserve">7. </w:t>
-      </w:r>
-      <w:r>
-        <w:rPr>
-          <w:rFonts w:ascii="Aptos" w:hAnsi="Aptos"/>
-          <w:b/>
-        </w:rPr>
-        <w:t>Refresh behavior:</w:t>
-      </w:r>
-      <w:r>
-        <w:rPr>
-          <w:rFonts w:ascii="Aptos" w:hAnsi="Aptos"/>
-        </w:rPr>
-        <w:t xml:space="preserve"> Automatic reruns and caching introduce a delay between new S3 data becoming available and that data being displayed.</w:t>
+        <w:t>7. Refresh behavior: Automatic reruns and caching can introduce a delay between new S3 data becoming available and that data being displayed.</w:t>
       </w:r>
     </w:p>
     <w:p>
@@ -5521,10 +5390,7 @@
     </w:p>
     <w:p>
       <w:r>
-        <w:rPr>
-          <w:rFonts w:ascii="Aptos" w:hAnsi="Aptos"/>
-        </w:rPr>
-        <w:t>The implementation supports MQTT request handling, serverless processing, caller-identity inspection, S3 result storage, MQTT responses, dashboard visualizations, CSV export, and periodic refresh.</w:t>
+        <w:t>The implementation supports MQTT request handling, Lambda-based validation and processing, caller-identity inspection for valid requests, S3 result storage, MQTT responses, dashboard visualizations, CSV export, and periodic refresh. Tests confirmed that missing, empty, and numeric request IDs are rejected and that failure reports can still be stored successfully.</w:t>
       </w:r>
     </w:p>
     <w:p>

</xml_diff>